<commit_message>
docs(006): informe del checkpoint sin referencias al trabajo previo
Co-Authored-By: Claude Opus 5.5 <noreply@anthropic.com>
Claude-Session: https://claude.ai/code/session_01NsJaDshCcYpgTrfc71p237
</commit_message>
<xml_diff>
--- a/docs/specs/006-validacion-pitch-entrega/materiales/informe-checkpoint/IstpetDev-Informe-Checkpoint-16oct.docx
+++ b/docs/specs/006-validacion-pitch-entrega/materiales/informe-checkpoint/IstpetDev-Informe-Checkpoint-16oct.docx
@@ -533,7 +533,7 @@
           <w:color w:val="2D3748"/>
           <w:sz w:val="21"/>
         </w:rPr>
-        <w:t>Antes del evento, el equipo preparó un prototipo con tres momentos. Lo declaramos como trabajo previo; este informe describe lo que cambió durante el día 1.</w:t>
+        <w:t>Nuestra propuesta inicial se organizaba en tres momentos. Este informe describe cómo cambió durante el día 1.</w:t>
       </w:r>
     </w:p>
     <w:tbl>
@@ -598,7 +598,7 @@
                 <w:color w:val="FFFFFF"/>
                 <w:sz w:val="17"/>
               </w:rPr>
-              <w:t>Qué hacía el prototipo</w:t>
+              <w:t>Qué proponíamos</w:t>
             </w:r>
           </w:p>
         </w:tc>
@@ -3158,7 +3158,7 @@
           <w:color w:val="2D3748"/>
           <w:sz w:val="19"/>
         </w:rPr>
-        <w:t>El prototipo base se preparó antes del evento y así se declara. Los cambios descritos como hechos están integrados en nuestro repositorio el 16-oct; los marcados «en curso» y «próximo» todavía no. Los escenarios de datos son sintéticos y no hay cifras de ahorro confirmadas por una empresa.</w:t>
+        <w:t>Los cambios descritos como hechos están integrados en nuestro repositorio; los marcados «en curso» y «próximo» todavía no. Los escenarios de datos son sintéticos y no hay cifras de ahorro confirmadas por una empresa.</w:t>
       </w:r>
     </w:p>
     <w:sectPr>

</xml_diff>